<commit_message>
added the DragonBallZ API to the jQuery Ajax lab
</commit_message>
<xml_diff>
--- a/Labs/jQuery/17 - Ajax jQuery.docx
+++ b/Labs/jQuery/17 - Ajax jQuery.docx
@@ -1,6 +1,6 @@
 
 <file path=word/document.xml><?xml version="1.0" encoding="utf-8"?>
-<w:document xmlns:wpc="http://schemas.microsoft.com/office/word/2010/wordprocessingCanvas" xmlns:cx="http://schemas.microsoft.com/office/drawing/2014/chartex" xmlns:cx1="http://schemas.microsoft.com/office/drawing/2015/9/8/chartex" xmlns:cx2="http://schemas.microsoft.com/office/drawing/2015/10/21/chartex" xmlns:cx3="http://schemas.microsoft.com/office/drawing/2016/5/9/chartex" xmlns:cx4="http://schemas.microsoft.com/office/drawing/2016/5/10/chartex" xmlns:cx5="http://schemas.microsoft.com/office/drawing/2016/5/11/chartex" xmlns:cx6="http://schemas.microsoft.com/office/drawing/2016/5/12/chartex" xmlns:cx7="http://schemas.microsoft.com/office/drawing/2016/5/13/chartex" xmlns:cx8="http://schemas.microsoft.com/office/drawing/2016/5/14/chartex" xmlns:mc="http://schemas.openxmlformats.org/markup-compatibility/2006" xmlns:aink="http://schemas.microsoft.com/office/drawing/2016/ink" xmlns:am3d="http://schemas.microsoft.com/office/drawing/2017/model3d" xmlns:o="urn:schemas-microsoft-com:office:office" xmlns:oel="http://schemas.microsoft.com/office/2019/extlst" xmlns:r="http://schemas.openxmlformats.org/officeDocument/2006/relationships" xmlns:m="http://schemas.openxmlformats.org/officeDocument/2006/math" xmlns:v="urn:schemas-microsoft-com:vml" xmlns:wp14="http://schemas.microsoft.com/office/word/2010/wordprocessingDrawing" xmlns:wp="http://schemas.openxmlformats.org/drawingml/2006/wordprocessingDrawing" xmlns:w10="urn:schemas-microsoft-com:office:word" xmlns:w="http://schemas.openxmlformats.org/wordprocessingml/2006/main" xmlns:w14="http://schemas.microsoft.com/office/word/2010/wordml" xmlns:w15="http://schemas.microsoft.com/office/word/2012/wordml" xmlns:w16cex="http://schemas.microsoft.com/office/word/2018/wordml/cex" xmlns:w16cid="http://schemas.microsoft.com/office/word/2016/wordml/cid" xmlns:w16="http://schemas.microsoft.com/office/word/2018/wordml" xmlns:w16sdtdh="http://schemas.microsoft.com/office/word/2020/wordml/sdtdatahash" xmlns:w16se="http://schemas.microsoft.com/office/word/2015/wordml/symex" xmlns:wpg="http://schemas.microsoft.com/office/word/2010/wordprocessingGroup" xmlns:wpi="http://schemas.microsoft.com/office/word/2010/wordprocessingInk" xmlns:wne="http://schemas.microsoft.com/office/word/2006/wordml" xmlns:wps="http://schemas.microsoft.com/office/word/2010/wordprocessingShape" mc:Ignorable="w14 w15 w16se w16cid w16 w16cex w16sdtdh wp14">
+<w:document xmlns:wpc="http://schemas.microsoft.com/office/word/2010/wordprocessingCanvas" xmlns:cx="http://schemas.microsoft.com/office/drawing/2014/chartex" xmlns:cx1="http://schemas.microsoft.com/office/drawing/2015/9/8/chartex" xmlns:cx2="http://schemas.microsoft.com/office/drawing/2015/10/21/chartex" xmlns:cx3="http://schemas.microsoft.com/office/drawing/2016/5/9/chartex" xmlns:cx4="http://schemas.microsoft.com/office/drawing/2016/5/10/chartex" xmlns:cx5="http://schemas.microsoft.com/office/drawing/2016/5/11/chartex" xmlns:cx6="http://schemas.microsoft.com/office/drawing/2016/5/12/chartex" xmlns:cx7="http://schemas.microsoft.com/office/drawing/2016/5/13/chartex" xmlns:cx8="http://schemas.microsoft.com/office/drawing/2016/5/14/chartex" xmlns:mc="http://schemas.openxmlformats.org/markup-compatibility/2006" xmlns:aink="http://schemas.microsoft.com/office/drawing/2016/ink" xmlns:am3d="http://schemas.microsoft.com/office/drawing/2017/model3d" xmlns:o="urn:schemas-microsoft-com:office:office" xmlns:oel="http://schemas.microsoft.com/office/2019/extlst" xmlns:r="http://schemas.openxmlformats.org/officeDocument/2006/relationships" xmlns:m="http://schemas.openxmlformats.org/officeDocument/2006/math" xmlns:v="urn:schemas-microsoft-com:vml" xmlns:wp14="http://schemas.microsoft.com/office/word/2010/wordprocessingDrawing" xmlns:wp="http://schemas.openxmlformats.org/drawingml/2006/wordprocessingDrawing" xmlns:w10="urn:schemas-microsoft-com:office:word" xmlns:w="http://schemas.openxmlformats.org/wordprocessingml/2006/main" xmlns:w14="http://schemas.microsoft.com/office/word/2010/wordml" xmlns:w15="http://schemas.microsoft.com/office/word/2012/wordml" xmlns:w16cex="http://schemas.microsoft.com/office/word/2018/wordml/cex" xmlns:w16cid="http://schemas.microsoft.com/office/word/2016/wordml/cid" xmlns:w16="http://schemas.microsoft.com/office/word/2018/wordml" xmlns:w16du="http://schemas.microsoft.com/office/word/2023/wordml/word16du" xmlns:w16sdtdh="http://schemas.microsoft.com/office/word/2020/wordml/sdtdatahash" xmlns:w16sdtfl="http://schemas.microsoft.com/office/word/2024/wordml/sdtformatlock" xmlns:w16se="http://schemas.microsoft.com/office/word/2015/wordml/symex" xmlns:wpg="http://schemas.microsoft.com/office/word/2010/wordprocessingGroup" xmlns:wpi="http://schemas.microsoft.com/office/word/2010/wordprocessingInk" xmlns:wne="http://schemas.microsoft.com/office/word/2006/wordml" xmlns:wps="http://schemas.microsoft.com/office/word/2010/wordprocessingShape" mc:Ignorable="w14 w15 w16se w16cid w16 w16cex w16sdtdh w16sdtfl w16du wp14">
   <w:body>
     <w:p>
       <w:pPr>
@@ -240,8 +240,13 @@
         <w:t>In this exercise you will experiment with</w:t>
       </w:r>
       <w:r>
-        <w:t xml:space="preserve"> Ajax using JQuery</w:t>
-      </w:r>
+        <w:t xml:space="preserve"> Ajax using </w:t>
+      </w:r>
+      <w:proofErr w:type="spellStart"/>
+      <w:r>
+        <w:t>JQuery</w:t>
+      </w:r>
+      <w:proofErr w:type="spellEnd"/>
     </w:p>
     <w:p>
       <w:pPr>
@@ -341,8 +346,13 @@
       </w:r>
     </w:p>
     <w:p>
-      <w:r>
-        <w:t>First of all, you will run a web server on your own computer. To do this:</w:t>
+      <w:proofErr w:type="gramStart"/>
+      <w:r>
+        <w:t>First of all</w:t>
+      </w:r>
+      <w:proofErr w:type="gramEnd"/>
+      <w:r>
+        <w:t>, you will run a web server on your own computer. To do this:</w:t>
       </w:r>
     </w:p>
     <w:p>
@@ -355,7 +365,15 @@
         <w:ind w:left="714" w:hanging="357"/>
       </w:pPr>
       <w:r>
-        <w:t>Locate the WebService folder within the starters folder for this chapter</w:t>
+        <w:t xml:space="preserve">Locate the </w:t>
+      </w:r>
+      <w:proofErr w:type="spellStart"/>
+      <w:r>
+        <w:t>WebService</w:t>
+      </w:r>
+      <w:proofErr w:type="spellEnd"/>
+      <w:r>
+        <w:t xml:space="preserve"> folder within the starters folder for this chapter</w:t>
       </w:r>
     </w:p>
     <w:p>
@@ -383,7 +401,15 @@
         <w:br/>
       </w:r>
       <w:r>
-        <w:t>This will open up a Command window.</w:t>
+        <w:t xml:space="preserve">This will </w:t>
+      </w:r>
+      <w:proofErr w:type="gramStart"/>
+      <w:r>
+        <w:t>open up</w:t>
+      </w:r>
+      <w:proofErr w:type="gramEnd"/>
+      <w:r>
+        <w:t xml:space="preserve"> a Command window.</w:t>
       </w:r>
     </w:p>
     <w:p>
@@ -406,7 +432,15 @@
         <w:t xml:space="preserve">Next, </w:t>
       </w:r>
       <w:r>
-        <w:t xml:space="preserve">use a code like the </w:t>
+        <w:t xml:space="preserve">use </w:t>
+      </w:r>
+      <w:proofErr w:type="gramStart"/>
+      <w:r>
+        <w:t>a code</w:t>
+      </w:r>
+      <w:proofErr w:type="gramEnd"/>
+      <w:r>
+        <w:t xml:space="preserve"> like the </w:t>
       </w:r>
       <w:r>
         <w:t xml:space="preserve">ones on the </w:t>
@@ -431,6 +465,7 @@
       <w:r>
         <w:t xml:space="preserve"> and then display the </w:t>
       </w:r>
+      <w:proofErr w:type="spellStart"/>
       <w:r>
         <w:rPr>
           <w:b/>
@@ -438,6 +473,7 @@
         </w:rPr>
         <w:t>ContactName</w:t>
       </w:r>
+      <w:proofErr w:type="spellEnd"/>
       <w:r>
         <w:t xml:space="preserve"> attribute of each customer</w:t>
       </w:r>
@@ -453,7 +489,20 @@
         <w:t>’s</w:t>
       </w:r>
       <w:r>
-        <w:t xml:space="preserve"> getJSON() method</w:t>
+        <w:t xml:space="preserve"> </w:t>
+      </w:r>
+      <w:proofErr w:type="spellStart"/>
+      <w:proofErr w:type="gramStart"/>
+      <w:r>
+        <w:t>getJSON</w:t>
+      </w:r>
+      <w:proofErr w:type="spellEnd"/>
+      <w:r>
+        <w:t>(</w:t>
+      </w:r>
+      <w:proofErr w:type="gramEnd"/>
+      <w:r>
+        <w:t>) method</w:t>
       </w:r>
       <w:r>
         <w:t xml:space="preserve"> which </w:t>
@@ -500,7 +549,15 @@
         </w:r>
       </w:hyperlink>
       <w:r>
-        <w:t xml:space="preserve"> and have a look at the results. Can you recognise that t</w:t>
+        <w:t xml:space="preserve"> and have a look at the results. Can you </w:t>
+      </w:r>
+      <w:proofErr w:type="spellStart"/>
+      <w:r>
+        <w:t>recognise</w:t>
+      </w:r>
+      <w:proofErr w:type="spellEnd"/>
+      <w:r>
+        <w:t xml:space="preserve"> that t</w:t>
       </w:r>
       <w:r>
         <w:t>his URL returns some JSON data?</w:t>
@@ -582,7 +639,15 @@
         <w:ind w:left="714" w:hanging="357"/>
       </w:pPr>
       <w:r>
-        <w:t xml:space="preserve">Use Google to find a JSON formatter. Copy and paste the contents of the previous web request into a JSON formatter, and then examine the results. What do you think </w:t>
+        <w:t xml:space="preserve">Use Google to find a JSON formatter. Copy and paste the contents of the previous web request into a JSON </w:t>
+      </w:r>
+      <w:proofErr w:type="gramStart"/>
+      <w:r>
+        <w:t>formatter, and</w:t>
+      </w:r>
+      <w:proofErr w:type="gramEnd"/>
+      <w:r>
+        <w:t xml:space="preserve"> then examine the results. What do you think </w:t>
       </w:r>
       <w:r>
         <w:t>this JSON data is telling you?</w:t>
@@ -601,7 +666,15 @@
         <w:ind w:left="714" w:hanging="357"/>
       </w:pPr>
       <w:r>
-        <w:t>Create a web page which uses JQuery and AJAX to show the most relevant parts of the JSON data to the user:</w:t>
+        <w:t xml:space="preserve">Create a web page which uses </w:t>
+      </w:r>
+      <w:proofErr w:type="spellStart"/>
+      <w:r>
+        <w:t>JQuery</w:t>
+      </w:r>
+      <w:proofErr w:type="spellEnd"/>
+      <w:r>
+        <w:t xml:space="preserve"> and AJAX to show the most relevant parts of the JSON data to the user:</w:t>
       </w:r>
     </w:p>
     <w:p>
@@ -632,10 +705,31 @@
         <w:ind w:left="1071" w:firstLine="0"/>
       </w:pPr>
       <w:r>
-        <w:t>Therefore, inside the $(document).ready() function, you will ne</w:t>
-      </w:r>
-      <w:r>
-        <w:t>ed to add a call to $.getJSON()</w:t>
+        <w:t>Therefore, inside the $(document</w:t>
+      </w:r>
+      <w:proofErr w:type="gramStart"/>
+      <w:r>
+        <w:t>).ready</w:t>
+      </w:r>
+      <w:proofErr w:type="gramEnd"/>
+      <w:r>
+        <w:t>() function, you will ne</w:t>
+      </w:r>
+      <w:r>
+        <w:t xml:space="preserve">ed to add a call to </w:t>
+      </w:r>
+      <w:proofErr w:type="gramStart"/>
+      <w:r>
+        <w:t>$.</w:t>
+      </w:r>
+      <w:proofErr w:type="spellStart"/>
+      <w:r>
+        <w:t>getJSON</w:t>
+      </w:r>
+      <w:proofErr w:type="spellEnd"/>
+      <w:proofErr w:type="gramEnd"/>
+      <w:r>
+        <w:t>()</w:t>
       </w:r>
     </w:p>
     <w:p>
@@ -651,7 +745,15 @@
         <w:ind w:left="1071" w:hanging="357"/>
       </w:pPr>
       <w:r>
-        <w:t>Notice that the JSON contains an array. Therefore, you will need some kind of loop to go through each item in the array. An alternative would be to use $.each() to go through each item in the array</w:t>
+        <w:t xml:space="preserve">Notice that the JSON contains an array. Therefore, you will need some kind of loop to go through each item in the array. An alternative would be to use </w:t>
+      </w:r>
+      <w:proofErr w:type="gramStart"/>
+      <w:r>
+        <w:t>$.each</w:t>
+      </w:r>
+      <w:proofErr w:type="gramEnd"/>
+      <w:r>
+        <w:t>() to go through each item in the array</w:t>
       </w:r>
       <w:r>
         <w:t>.</w:t>
@@ -692,7 +794,15 @@
         <w:t>Additionally, each item in the array contains a su</w:t>
       </w:r>
       <w:r>
-        <w:t>b-array called “lineStatuses”.</w:t>
+        <w:t>b-array called “</w:t>
+      </w:r>
+      <w:proofErr w:type="spellStart"/>
+      <w:r>
+        <w:t>lineStatuses</w:t>
+      </w:r>
+      <w:proofErr w:type="spellEnd"/>
+      <w:r>
+        <w:t>”.</w:t>
       </w:r>
     </w:p>
     <w:p>
@@ -723,7 +833,15 @@
         <w:t>From this first item, retrieve and display t</w:t>
       </w:r>
       <w:r>
-        <w:t>he “statusSeverityDescription”.</w:t>
+        <w:t>he “</w:t>
+      </w:r>
+      <w:proofErr w:type="spellStart"/>
+      <w:r>
+        <w:t>statusSeverityDescription</w:t>
+      </w:r>
+      <w:proofErr w:type="spellEnd"/>
+      <w:r>
+        <w:t>”.</w:t>
       </w:r>
     </w:p>
     <w:p>
@@ -742,6 +860,28 @@
         <w:t>Ensure the data is displayed to the user in an appropriate format, so that the user can read it clearly!</w:t>
       </w:r>
     </w:p>
+    <w:p/>
+    <w:p>
+      <w:r>
+        <w:rPr>
+          <w:b/>
+          <w:bCs/>
+        </w:rPr>
+        <w:t>For those who wish to have even more fun with APIs:</w:t>
+      </w:r>
+      <w:r>
+        <w:br/>
+      </w:r>
+      <w:hyperlink r:id="rId17" w:history="1">
+        <w:r>
+          <w:rPr>
+            <w:rStyle w:val="Hyperlink"/>
+          </w:rPr>
+          <w:t>https://dragonball-api.com/api/characters?limit=4&amp;page=1</w:t>
+        </w:r>
+      </w:hyperlink>
+    </w:p>
+    <w:p/>
     <w:p>
       <w:pPr>
         <w:pStyle w:val="ParagraphBullet"/>
@@ -771,7 +911,7 @@
     </w:p>
     <w:p/>
     <w:sectPr>
-      <w:headerReference w:type="default" r:id="rId17"/>
+      <w:headerReference w:type="default" r:id="rId18"/>
       <w:pgSz w:w="11907" w:h="16839" w:code="9"/>
       <w:pgMar w:top="1440" w:right="1440" w:bottom="1440" w:left="1440" w:header="709" w:footer="130" w:gutter="0"/>
       <w:cols w:space="720"/>
@@ -782,7 +922,7 @@
 </file>
 
 <file path=word/endnotes.xml><?xml version="1.0" encoding="utf-8"?>
-<w:endnotes xmlns:wpc="http://schemas.microsoft.com/office/word/2010/wordprocessingCanvas" xmlns:cx="http://schemas.microsoft.com/office/drawing/2014/chartex" xmlns:cx1="http://schemas.microsoft.com/office/drawing/2015/9/8/chartex" xmlns:cx2="http://schemas.microsoft.com/office/drawing/2015/10/21/chartex" xmlns:cx3="http://schemas.microsoft.com/office/drawing/2016/5/9/chartex" xmlns:cx4="http://schemas.microsoft.com/office/drawing/2016/5/10/chartex" xmlns:cx5="http://schemas.microsoft.com/office/drawing/2016/5/11/chartex" xmlns:cx6="http://schemas.microsoft.com/office/drawing/2016/5/12/chartex" xmlns:cx7="http://schemas.microsoft.com/office/drawing/2016/5/13/chartex" xmlns:cx8="http://schemas.microsoft.com/office/drawing/2016/5/14/chartex" xmlns:mc="http://schemas.openxmlformats.org/markup-compatibility/2006" xmlns:aink="http://schemas.microsoft.com/office/drawing/2016/ink" xmlns:am3d="http://schemas.microsoft.com/office/drawing/2017/model3d" xmlns:o="urn:schemas-microsoft-com:office:office" xmlns:oel="http://schemas.microsoft.com/office/2019/extlst" xmlns:r="http://schemas.openxmlformats.org/officeDocument/2006/relationships" xmlns:m="http://schemas.openxmlformats.org/officeDocument/2006/math" xmlns:v="urn:schemas-microsoft-com:vml" xmlns:wp14="http://schemas.microsoft.com/office/word/2010/wordprocessingDrawing" xmlns:wp="http://schemas.openxmlformats.org/drawingml/2006/wordprocessingDrawing" xmlns:w10="urn:schemas-microsoft-com:office:word" xmlns:w="http://schemas.openxmlformats.org/wordprocessingml/2006/main" xmlns:w14="http://schemas.microsoft.com/office/word/2010/wordml" xmlns:w15="http://schemas.microsoft.com/office/word/2012/wordml" xmlns:w16cex="http://schemas.microsoft.com/office/word/2018/wordml/cex" xmlns:w16cid="http://schemas.microsoft.com/office/word/2016/wordml/cid" xmlns:w16="http://schemas.microsoft.com/office/word/2018/wordml" xmlns:w16sdtdh="http://schemas.microsoft.com/office/word/2020/wordml/sdtdatahash" xmlns:w16se="http://schemas.microsoft.com/office/word/2015/wordml/symex" xmlns:wpg="http://schemas.microsoft.com/office/word/2010/wordprocessingGroup" xmlns:wpi="http://schemas.microsoft.com/office/word/2010/wordprocessingInk" xmlns:wne="http://schemas.microsoft.com/office/word/2006/wordml" xmlns:wps="http://schemas.microsoft.com/office/word/2010/wordprocessingShape" mc:Ignorable="w14 w15 w16se w16cid w16 w16cex w16sdtdh wp14">
+<w:endnotes xmlns:wpc="http://schemas.microsoft.com/office/word/2010/wordprocessingCanvas" xmlns:cx="http://schemas.microsoft.com/office/drawing/2014/chartex" xmlns:cx1="http://schemas.microsoft.com/office/drawing/2015/9/8/chartex" xmlns:cx2="http://schemas.microsoft.com/office/drawing/2015/10/21/chartex" xmlns:cx3="http://schemas.microsoft.com/office/drawing/2016/5/9/chartex" xmlns:cx4="http://schemas.microsoft.com/office/drawing/2016/5/10/chartex" xmlns:cx5="http://schemas.microsoft.com/office/drawing/2016/5/11/chartex" xmlns:cx6="http://schemas.microsoft.com/office/drawing/2016/5/12/chartex" xmlns:cx7="http://schemas.microsoft.com/office/drawing/2016/5/13/chartex" xmlns:cx8="http://schemas.microsoft.com/office/drawing/2016/5/14/chartex" xmlns:mc="http://schemas.openxmlformats.org/markup-compatibility/2006" xmlns:aink="http://schemas.microsoft.com/office/drawing/2016/ink" xmlns:am3d="http://schemas.microsoft.com/office/drawing/2017/model3d" xmlns:o="urn:schemas-microsoft-com:office:office" xmlns:oel="http://schemas.microsoft.com/office/2019/extlst" xmlns:r="http://schemas.openxmlformats.org/officeDocument/2006/relationships" xmlns:m="http://schemas.openxmlformats.org/officeDocument/2006/math" xmlns:v="urn:schemas-microsoft-com:vml" xmlns:wp14="http://schemas.microsoft.com/office/word/2010/wordprocessingDrawing" xmlns:wp="http://schemas.openxmlformats.org/drawingml/2006/wordprocessingDrawing" xmlns:w10="urn:schemas-microsoft-com:office:word" xmlns:w="http://schemas.openxmlformats.org/wordprocessingml/2006/main" xmlns:w14="http://schemas.microsoft.com/office/word/2010/wordml" xmlns:w15="http://schemas.microsoft.com/office/word/2012/wordml" xmlns:w16cex="http://schemas.microsoft.com/office/word/2018/wordml/cex" xmlns:w16cid="http://schemas.microsoft.com/office/word/2016/wordml/cid" xmlns:w16="http://schemas.microsoft.com/office/word/2018/wordml" xmlns:w16du="http://schemas.microsoft.com/office/word/2023/wordml/word16du" xmlns:w16sdtdh="http://schemas.microsoft.com/office/word/2020/wordml/sdtdatahash" xmlns:w16sdtfl="http://schemas.microsoft.com/office/word/2024/wordml/sdtformatlock" xmlns:w16se="http://schemas.microsoft.com/office/word/2015/wordml/symex" xmlns:wpg="http://schemas.microsoft.com/office/word/2010/wordprocessingGroup" xmlns:wpi="http://schemas.microsoft.com/office/word/2010/wordprocessingInk" xmlns:wne="http://schemas.microsoft.com/office/word/2006/wordml" xmlns:wps="http://schemas.microsoft.com/office/word/2010/wordprocessingShape" mc:Ignorable="w14 w15 w16se w16cid w16 w16cex w16sdtdh w16sdtfl w16du wp14">
   <w:endnote w:type="separator" w:id="-1">
     <w:p>
       <w:pPr>
@@ -807,7 +947,7 @@
 </file>
 
 <file path=word/footer1.xml><?xml version="1.0" encoding="utf-8"?>
-<w:ftr xmlns:wpc="http://schemas.microsoft.com/office/word/2010/wordprocessingCanvas" xmlns:cx="http://schemas.microsoft.com/office/drawing/2014/chartex" xmlns:cx1="http://schemas.microsoft.com/office/drawing/2015/9/8/chartex" xmlns:cx2="http://schemas.microsoft.com/office/drawing/2015/10/21/chartex" xmlns:cx3="http://schemas.microsoft.com/office/drawing/2016/5/9/chartex" xmlns:cx4="http://schemas.microsoft.com/office/drawing/2016/5/10/chartex" xmlns:cx5="http://schemas.microsoft.com/office/drawing/2016/5/11/chartex" xmlns:cx6="http://schemas.microsoft.com/office/drawing/2016/5/12/chartex" xmlns:cx7="http://schemas.microsoft.com/office/drawing/2016/5/13/chartex" xmlns:cx8="http://schemas.microsoft.com/office/drawing/2016/5/14/chartex" xmlns:mc="http://schemas.openxmlformats.org/markup-compatibility/2006" xmlns:aink="http://schemas.microsoft.com/office/drawing/2016/ink" xmlns:am3d="http://schemas.microsoft.com/office/drawing/2017/model3d" xmlns:o="urn:schemas-microsoft-com:office:office" xmlns:oel="http://schemas.microsoft.com/office/2019/extlst" xmlns:r="http://schemas.openxmlformats.org/officeDocument/2006/relationships" xmlns:m="http://schemas.openxmlformats.org/officeDocument/2006/math" xmlns:v="urn:schemas-microsoft-com:vml" xmlns:wp14="http://schemas.microsoft.com/office/word/2010/wordprocessingDrawing" xmlns:wp="http://schemas.openxmlformats.org/drawingml/2006/wordprocessingDrawing" xmlns:w10="urn:schemas-microsoft-com:office:word" xmlns:w="http://schemas.openxmlformats.org/wordprocessingml/2006/main" xmlns:w14="http://schemas.microsoft.com/office/word/2010/wordml" xmlns:w15="http://schemas.microsoft.com/office/word/2012/wordml" xmlns:w16cex="http://schemas.microsoft.com/office/word/2018/wordml/cex" xmlns:w16cid="http://schemas.microsoft.com/office/word/2016/wordml/cid" xmlns:w16="http://schemas.microsoft.com/office/word/2018/wordml" xmlns:w16sdtdh="http://schemas.microsoft.com/office/word/2020/wordml/sdtdatahash" xmlns:w16se="http://schemas.microsoft.com/office/word/2015/wordml/symex" xmlns:wpg="http://schemas.microsoft.com/office/word/2010/wordprocessingGroup" xmlns:wpi="http://schemas.microsoft.com/office/word/2010/wordprocessingInk" xmlns:wne="http://schemas.microsoft.com/office/word/2006/wordml" xmlns:wps="http://schemas.microsoft.com/office/word/2010/wordprocessingShape" mc:Ignorable="w14 w15 w16se w16cid w16 w16cex w16sdtdh wp14">
+<w:ftr xmlns:wpc="http://schemas.microsoft.com/office/word/2010/wordprocessingCanvas" xmlns:cx="http://schemas.microsoft.com/office/drawing/2014/chartex" xmlns:cx1="http://schemas.microsoft.com/office/drawing/2015/9/8/chartex" xmlns:cx2="http://schemas.microsoft.com/office/drawing/2015/10/21/chartex" xmlns:cx3="http://schemas.microsoft.com/office/drawing/2016/5/9/chartex" xmlns:cx4="http://schemas.microsoft.com/office/drawing/2016/5/10/chartex" xmlns:cx5="http://schemas.microsoft.com/office/drawing/2016/5/11/chartex" xmlns:cx6="http://schemas.microsoft.com/office/drawing/2016/5/12/chartex" xmlns:cx7="http://schemas.microsoft.com/office/drawing/2016/5/13/chartex" xmlns:cx8="http://schemas.microsoft.com/office/drawing/2016/5/14/chartex" xmlns:mc="http://schemas.openxmlformats.org/markup-compatibility/2006" xmlns:aink="http://schemas.microsoft.com/office/drawing/2016/ink" xmlns:am3d="http://schemas.microsoft.com/office/drawing/2017/model3d" xmlns:o="urn:schemas-microsoft-com:office:office" xmlns:oel="http://schemas.microsoft.com/office/2019/extlst" xmlns:r="http://schemas.openxmlformats.org/officeDocument/2006/relationships" xmlns:m="http://schemas.openxmlformats.org/officeDocument/2006/math" xmlns:v="urn:schemas-microsoft-com:vml" xmlns:wp14="http://schemas.microsoft.com/office/word/2010/wordprocessingDrawing" xmlns:wp="http://schemas.openxmlformats.org/drawingml/2006/wordprocessingDrawing" xmlns:w10="urn:schemas-microsoft-com:office:word" xmlns:w="http://schemas.openxmlformats.org/wordprocessingml/2006/main" xmlns:w14="http://schemas.microsoft.com/office/word/2010/wordml" xmlns:w15="http://schemas.microsoft.com/office/word/2012/wordml" xmlns:w16cex="http://schemas.microsoft.com/office/word/2018/wordml/cex" xmlns:w16cid="http://schemas.microsoft.com/office/word/2016/wordml/cid" xmlns:w16="http://schemas.microsoft.com/office/word/2018/wordml" xmlns:w16du="http://schemas.microsoft.com/office/word/2023/wordml/word16du" xmlns:w16sdtdh="http://schemas.microsoft.com/office/word/2020/wordml/sdtdatahash" xmlns:w16sdtfl="http://schemas.microsoft.com/office/word/2024/wordml/sdtformatlock" xmlns:w16se="http://schemas.microsoft.com/office/word/2015/wordml/symex" xmlns:wpg="http://schemas.microsoft.com/office/word/2010/wordprocessingGroup" xmlns:wpi="http://schemas.microsoft.com/office/word/2010/wordprocessingInk" xmlns:wne="http://schemas.microsoft.com/office/word/2006/wordml" xmlns:wps="http://schemas.microsoft.com/office/word/2010/wordprocessingShape" mc:Ignorable="w14 w15 w16se w16cid w16 w16cex w16sdtdh w16sdtfl w16du wp14">
   <w:p>
     <w:pPr>
       <w:pStyle w:val="Footer"/>
@@ -818,7 +958,7 @@
 </file>
 
 <file path=word/footer2.xml><?xml version="1.0" encoding="utf-8"?>
-<w:ftr xmlns:wpc="http://schemas.microsoft.com/office/word/2010/wordprocessingCanvas" xmlns:cx="http://schemas.microsoft.com/office/drawing/2014/chartex" xmlns:cx1="http://schemas.microsoft.com/office/drawing/2015/9/8/chartex" xmlns:cx2="http://schemas.microsoft.com/office/drawing/2015/10/21/chartex" xmlns:cx3="http://schemas.microsoft.com/office/drawing/2016/5/9/chartex" xmlns:cx4="http://schemas.microsoft.com/office/drawing/2016/5/10/chartex" xmlns:cx5="http://schemas.microsoft.com/office/drawing/2016/5/11/chartex" xmlns:cx6="http://schemas.microsoft.com/office/drawing/2016/5/12/chartex" xmlns:cx7="http://schemas.microsoft.com/office/drawing/2016/5/13/chartex" xmlns:cx8="http://schemas.microsoft.com/office/drawing/2016/5/14/chartex" xmlns:mc="http://schemas.openxmlformats.org/markup-compatibility/2006" xmlns:aink="http://schemas.microsoft.com/office/drawing/2016/ink" xmlns:am3d="http://schemas.microsoft.com/office/drawing/2017/model3d" xmlns:o="urn:schemas-microsoft-com:office:office" xmlns:oel="http://schemas.microsoft.com/office/2019/extlst" xmlns:r="http://schemas.openxmlformats.org/officeDocument/2006/relationships" xmlns:m="http://schemas.openxmlformats.org/officeDocument/2006/math" xmlns:v="urn:schemas-microsoft-com:vml" xmlns:wp14="http://schemas.microsoft.com/office/word/2010/wordprocessingDrawing" xmlns:wp="http://schemas.openxmlformats.org/drawingml/2006/wordprocessingDrawing" xmlns:w10="urn:schemas-microsoft-com:office:word" xmlns:w="http://schemas.openxmlformats.org/wordprocessingml/2006/main" xmlns:w14="http://schemas.microsoft.com/office/word/2010/wordml" xmlns:w15="http://schemas.microsoft.com/office/word/2012/wordml" xmlns:w16cex="http://schemas.microsoft.com/office/word/2018/wordml/cex" xmlns:w16cid="http://schemas.microsoft.com/office/word/2016/wordml/cid" xmlns:w16="http://schemas.microsoft.com/office/word/2018/wordml" xmlns:w16sdtdh="http://schemas.microsoft.com/office/word/2020/wordml/sdtdatahash" xmlns:w16se="http://schemas.microsoft.com/office/word/2015/wordml/symex" xmlns:wpg="http://schemas.microsoft.com/office/word/2010/wordprocessingGroup" xmlns:wpi="http://schemas.microsoft.com/office/word/2010/wordprocessingInk" xmlns:wne="http://schemas.microsoft.com/office/word/2006/wordml" xmlns:wps="http://schemas.microsoft.com/office/word/2010/wordprocessingShape" mc:Ignorable="w14 w15 w16se w16cid w16 w16cex w16sdtdh wp14">
+<w:ftr xmlns:wpc="http://schemas.microsoft.com/office/word/2010/wordprocessingCanvas" xmlns:cx="http://schemas.microsoft.com/office/drawing/2014/chartex" xmlns:cx1="http://schemas.microsoft.com/office/drawing/2015/9/8/chartex" xmlns:cx2="http://schemas.microsoft.com/office/drawing/2015/10/21/chartex" xmlns:cx3="http://schemas.microsoft.com/office/drawing/2016/5/9/chartex" xmlns:cx4="http://schemas.microsoft.com/office/drawing/2016/5/10/chartex" xmlns:cx5="http://schemas.microsoft.com/office/drawing/2016/5/11/chartex" xmlns:cx6="http://schemas.microsoft.com/office/drawing/2016/5/12/chartex" xmlns:cx7="http://schemas.microsoft.com/office/drawing/2016/5/13/chartex" xmlns:cx8="http://schemas.microsoft.com/office/drawing/2016/5/14/chartex" xmlns:mc="http://schemas.openxmlformats.org/markup-compatibility/2006" xmlns:aink="http://schemas.microsoft.com/office/drawing/2016/ink" xmlns:am3d="http://schemas.microsoft.com/office/drawing/2017/model3d" xmlns:o="urn:schemas-microsoft-com:office:office" xmlns:oel="http://schemas.microsoft.com/office/2019/extlst" xmlns:r="http://schemas.openxmlformats.org/officeDocument/2006/relationships" xmlns:m="http://schemas.openxmlformats.org/officeDocument/2006/math" xmlns:v="urn:schemas-microsoft-com:vml" xmlns:wp14="http://schemas.microsoft.com/office/word/2010/wordprocessingDrawing" xmlns:wp="http://schemas.openxmlformats.org/drawingml/2006/wordprocessingDrawing" xmlns:w10="urn:schemas-microsoft-com:office:word" xmlns:w="http://schemas.openxmlformats.org/wordprocessingml/2006/main" xmlns:w14="http://schemas.microsoft.com/office/word/2010/wordml" xmlns:w15="http://schemas.microsoft.com/office/word/2012/wordml" xmlns:w16cex="http://schemas.microsoft.com/office/word/2018/wordml/cex" xmlns:w16cid="http://schemas.microsoft.com/office/word/2016/wordml/cid" xmlns:w16="http://schemas.microsoft.com/office/word/2018/wordml" xmlns:w16du="http://schemas.microsoft.com/office/word/2023/wordml/word16du" xmlns:w16sdtdh="http://schemas.microsoft.com/office/word/2020/wordml/sdtdatahash" xmlns:w16sdtfl="http://schemas.microsoft.com/office/word/2024/wordml/sdtformatlock" xmlns:w16se="http://schemas.microsoft.com/office/word/2015/wordml/symex" xmlns:wpg="http://schemas.microsoft.com/office/word/2010/wordprocessingGroup" xmlns:wpi="http://schemas.microsoft.com/office/word/2010/wordprocessingInk" xmlns:wne="http://schemas.microsoft.com/office/word/2006/wordml" xmlns:wps="http://schemas.microsoft.com/office/word/2010/wordprocessingShape" mc:Ignorable="w14 w15 w16se w16cid w16 w16cex w16sdtdh w16sdtfl w16du wp14">
   <w:p>
     <w:pPr>
       <w:pStyle w:val="Footer"/>
@@ -862,7 +1002,7 @@
 </file>
 
 <file path=word/footnotes.xml><?xml version="1.0" encoding="utf-8"?>
-<w:footnotes xmlns:wpc="http://schemas.microsoft.com/office/word/2010/wordprocessingCanvas" xmlns:cx="http://schemas.microsoft.com/office/drawing/2014/chartex" xmlns:cx1="http://schemas.microsoft.com/office/drawing/2015/9/8/chartex" xmlns:cx2="http://schemas.microsoft.com/office/drawing/2015/10/21/chartex" xmlns:cx3="http://schemas.microsoft.com/office/drawing/2016/5/9/chartex" xmlns:cx4="http://schemas.microsoft.com/office/drawing/2016/5/10/chartex" xmlns:cx5="http://schemas.microsoft.com/office/drawing/2016/5/11/chartex" xmlns:cx6="http://schemas.microsoft.com/office/drawing/2016/5/12/chartex" xmlns:cx7="http://schemas.microsoft.com/office/drawing/2016/5/13/chartex" xmlns:cx8="http://schemas.microsoft.com/office/drawing/2016/5/14/chartex" xmlns:mc="http://schemas.openxmlformats.org/markup-compatibility/2006" xmlns:aink="http://schemas.microsoft.com/office/drawing/2016/ink" xmlns:am3d="http://schemas.microsoft.com/office/drawing/2017/model3d" xmlns:o="urn:schemas-microsoft-com:office:office" xmlns:oel="http://schemas.microsoft.com/office/2019/extlst" xmlns:r="http://schemas.openxmlformats.org/officeDocument/2006/relationships" xmlns:m="http://schemas.openxmlformats.org/officeDocument/2006/math" xmlns:v="urn:schemas-microsoft-com:vml" xmlns:wp14="http://schemas.microsoft.com/office/word/2010/wordprocessingDrawing" xmlns:wp="http://schemas.openxmlformats.org/drawingml/2006/wordprocessingDrawing" xmlns:w10="urn:schemas-microsoft-com:office:word" xmlns:w="http://schemas.openxmlformats.org/wordprocessingml/2006/main" xmlns:w14="http://schemas.microsoft.com/office/word/2010/wordml" xmlns:w15="http://schemas.microsoft.com/office/word/2012/wordml" xmlns:w16cex="http://schemas.microsoft.com/office/word/2018/wordml/cex" xmlns:w16cid="http://schemas.microsoft.com/office/word/2016/wordml/cid" xmlns:w16="http://schemas.microsoft.com/office/word/2018/wordml" xmlns:w16sdtdh="http://schemas.microsoft.com/office/word/2020/wordml/sdtdatahash" xmlns:w16se="http://schemas.microsoft.com/office/word/2015/wordml/symex" xmlns:wpg="http://schemas.microsoft.com/office/word/2010/wordprocessingGroup" xmlns:wpi="http://schemas.microsoft.com/office/word/2010/wordprocessingInk" xmlns:wne="http://schemas.microsoft.com/office/word/2006/wordml" xmlns:wps="http://schemas.microsoft.com/office/word/2010/wordprocessingShape" mc:Ignorable="w14 w15 w16se w16cid w16 w16cex w16sdtdh wp14">
+<w:footnotes xmlns:wpc="http://schemas.microsoft.com/office/word/2010/wordprocessingCanvas" xmlns:cx="http://schemas.microsoft.com/office/drawing/2014/chartex" xmlns:cx1="http://schemas.microsoft.com/office/drawing/2015/9/8/chartex" xmlns:cx2="http://schemas.microsoft.com/office/drawing/2015/10/21/chartex" xmlns:cx3="http://schemas.microsoft.com/office/drawing/2016/5/9/chartex" xmlns:cx4="http://schemas.microsoft.com/office/drawing/2016/5/10/chartex" xmlns:cx5="http://schemas.microsoft.com/office/drawing/2016/5/11/chartex" xmlns:cx6="http://schemas.microsoft.com/office/drawing/2016/5/12/chartex" xmlns:cx7="http://schemas.microsoft.com/office/drawing/2016/5/13/chartex" xmlns:cx8="http://schemas.microsoft.com/office/drawing/2016/5/14/chartex" xmlns:mc="http://schemas.openxmlformats.org/markup-compatibility/2006" xmlns:aink="http://schemas.microsoft.com/office/drawing/2016/ink" xmlns:am3d="http://schemas.microsoft.com/office/drawing/2017/model3d" xmlns:o="urn:schemas-microsoft-com:office:office" xmlns:oel="http://schemas.microsoft.com/office/2019/extlst" xmlns:r="http://schemas.openxmlformats.org/officeDocument/2006/relationships" xmlns:m="http://schemas.openxmlformats.org/officeDocument/2006/math" xmlns:v="urn:schemas-microsoft-com:vml" xmlns:wp14="http://schemas.microsoft.com/office/word/2010/wordprocessingDrawing" xmlns:wp="http://schemas.openxmlformats.org/drawingml/2006/wordprocessingDrawing" xmlns:w10="urn:schemas-microsoft-com:office:word" xmlns:w="http://schemas.openxmlformats.org/wordprocessingml/2006/main" xmlns:w14="http://schemas.microsoft.com/office/word/2010/wordml" xmlns:w15="http://schemas.microsoft.com/office/word/2012/wordml" xmlns:w16cex="http://schemas.microsoft.com/office/word/2018/wordml/cex" xmlns:w16cid="http://schemas.microsoft.com/office/word/2016/wordml/cid" xmlns:w16="http://schemas.microsoft.com/office/word/2018/wordml" xmlns:w16du="http://schemas.microsoft.com/office/word/2023/wordml/word16du" xmlns:w16sdtdh="http://schemas.microsoft.com/office/word/2020/wordml/sdtdatahash" xmlns:w16sdtfl="http://schemas.microsoft.com/office/word/2024/wordml/sdtformatlock" xmlns:w16se="http://schemas.microsoft.com/office/word/2015/wordml/symex" xmlns:wpg="http://schemas.microsoft.com/office/word/2010/wordprocessingGroup" xmlns:wpi="http://schemas.microsoft.com/office/word/2010/wordprocessingInk" xmlns:wne="http://schemas.microsoft.com/office/word/2006/wordml" xmlns:wps="http://schemas.microsoft.com/office/word/2010/wordprocessingShape" mc:Ignorable="w14 w15 w16se w16cid w16 w16cex w16sdtdh w16sdtfl w16du wp14">
   <w:footnote w:type="separator" w:id="-1">
     <w:p>
       <w:pPr>
@@ -887,7 +1027,7 @@
 </file>
 
 <file path=word/header1.xml><?xml version="1.0" encoding="utf-8"?>
-<w:hdr xmlns:wpc="http://schemas.microsoft.com/office/word/2010/wordprocessingCanvas" xmlns:cx="http://schemas.microsoft.com/office/drawing/2014/chartex" xmlns:cx1="http://schemas.microsoft.com/office/drawing/2015/9/8/chartex" xmlns:cx2="http://schemas.microsoft.com/office/drawing/2015/10/21/chartex" xmlns:cx3="http://schemas.microsoft.com/office/drawing/2016/5/9/chartex" xmlns:cx4="http://schemas.microsoft.com/office/drawing/2016/5/10/chartex" xmlns:cx5="http://schemas.microsoft.com/office/drawing/2016/5/11/chartex" xmlns:cx6="http://schemas.microsoft.com/office/drawing/2016/5/12/chartex" xmlns:cx7="http://schemas.microsoft.com/office/drawing/2016/5/13/chartex" xmlns:cx8="http://schemas.microsoft.com/office/drawing/2016/5/14/chartex" xmlns:mc="http://schemas.openxmlformats.org/markup-compatibility/2006" xmlns:aink="http://schemas.microsoft.com/office/drawing/2016/ink" xmlns:am3d="http://schemas.microsoft.com/office/drawing/2017/model3d" xmlns:o="urn:schemas-microsoft-com:office:office" xmlns:oel="http://schemas.microsoft.com/office/2019/extlst" xmlns:r="http://schemas.openxmlformats.org/officeDocument/2006/relationships" xmlns:m="http://schemas.openxmlformats.org/officeDocument/2006/math" xmlns:v="urn:schemas-microsoft-com:vml" xmlns:wp14="http://schemas.microsoft.com/office/word/2010/wordprocessingDrawing" xmlns:wp="http://schemas.openxmlformats.org/drawingml/2006/wordprocessingDrawing" xmlns:w10="urn:schemas-microsoft-com:office:word" xmlns:w="http://schemas.openxmlformats.org/wordprocessingml/2006/main" xmlns:w14="http://schemas.microsoft.com/office/word/2010/wordml" xmlns:w15="http://schemas.microsoft.com/office/word/2012/wordml" xmlns:w16cex="http://schemas.microsoft.com/office/word/2018/wordml/cex" xmlns:w16cid="http://schemas.microsoft.com/office/word/2016/wordml/cid" xmlns:w16="http://schemas.microsoft.com/office/word/2018/wordml" xmlns:w16sdtdh="http://schemas.microsoft.com/office/word/2020/wordml/sdtdatahash" xmlns:w16se="http://schemas.microsoft.com/office/word/2015/wordml/symex" xmlns:wpg="http://schemas.microsoft.com/office/word/2010/wordprocessingGroup" xmlns:wpi="http://schemas.microsoft.com/office/word/2010/wordprocessingInk" xmlns:wne="http://schemas.microsoft.com/office/word/2006/wordml" xmlns:wps="http://schemas.microsoft.com/office/word/2010/wordprocessingShape" mc:Ignorable="w14 w15 w16se w16cid w16 w16cex w16sdtdh wp14">
+<w:hdr xmlns:wpc="http://schemas.microsoft.com/office/word/2010/wordprocessingCanvas" xmlns:cx="http://schemas.microsoft.com/office/drawing/2014/chartex" xmlns:cx1="http://schemas.microsoft.com/office/drawing/2015/9/8/chartex" xmlns:cx2="http://schemas.microsoft.com/office/drawing/2015/10/21/chartex" xmlns:cx3="http://schemas.microsoft.com/office/drawing/2016/5/9/chartex" xmlns:cx4="http://schemas.microsoft.com/office/drawing/2016/5/10/chartex" xmlns:cx5="http://schemas.microsoft.com/office/drawing/2016/5/11/chartex" xmlns:cx6="http://schemas.microsoft.com/office/drawing/2016/5/12/chartex" xmlns:cx7="http://schemas.microsoft.com/office/drawing/2016/5/13/chartex" xmlns:cx8="http://schemas.microsoft.com/office/drawing/2016/5/14/chartex" xmlns:mc="http://schemas.openxmlformats.org/markup-compatibility/2006" xmlns:aink="http://schemas.microsoft.com/office/drawing/2016/ink" xmlns:am3d="http://schemas.microsoft.com/office/drawing/2017/model3d" xmlns:o="urn:schemas-microsoft-com:office:office" xmlns:oel="http://schemas.microsoft.com/office/2019/extlst" xmlns:r="http://schemas.openxmlformats.org/officeDocument/2006/relationships" xmlns:m="http://schemas.openxmlformats.org/officeDocument/2006/math" xmlns:v="urn:schemas-microsoft-com:vml" xmlns:wp14="http://schemas.microsoft.com/office/word/2010/wordprocessingDrawing" xmlns:wp="http://schemas.openxmlformats.org/drawingml/2006/wordprocessingDrawing" xmlns:w10="urn:schemas-microsoft-com:office:word" xmlns:w="http://schemas.openxmlformats.org/wordprocessingml/2006/main" xmlns:w14="http://schemas.microsoft.com/office/word/2010/wordml" xmlns:w15="http://schemas.microsoft.com/office/word/2012/wordml" xmlns:w16cex="http://schemas.microsoft.com/office/word/2018/wordml/cex" xmlns:w16cid="http://schemas.microsoft.com/office/word/2016/wordml/cid" xmlns:w16="http://schemas.microsoft.com/office/word/2018/wordml" xmlns:w16du="http://schemas.microsoft.com/office/word/2023/wordml/word16du" xmlns:w16sdtdh="http://schemas.microsoft.com/office/word/2020/wordml/sdtdatahash" xmlns:w16sdtfl="http://schemas.microsoft.com/office/word/2024/wordml/sdtformatlock" xmlns:w16se="http://schemas.microsoft.com/office/word/2015/wordml/symex" xmlns:wpg="http://schemas.microsoft.com/office/word/2010/wordprocessingGroup" xmlns:wpi="http://schemas.microsoft.com/office/word/2010/wordprocessingInk" xmlns:wne="http://schemas.microsoft.com/office/word/2006/wordml" xmlns:wps="http://schemas.microsoft.com/office/word/2010/wordprocessingShape" mc:Ignorable="w14 w15 w16se w16cid w16 w16cex w16sdtdh w16sdtfl w16du wp14">
   <w:p>
     <w:pPr>
       <w:pStyle w:val="Header"/>
@@ -974,7 +1114,7 @@
 </file>
 
 <file path=word/header2.xml><?xml version="1.0" encoding="utf-8"?>
-<w:hdr xmlns:wpc="http://schemas.microsoft.com/office/word/2010/wordprocessingCanvas" xmlns:cx="http://schemas.microsoft.com/office/drawing/2014/chartex" xmlns:cx1="http://schemas.microsoft.com/office/drawing/2015/9/8/chartex" xmlns:cx2="http://schemas.microsoft.com/office/drawing/2015/10/21/chartex" xmlns:cx3="http://schemas.microsoft.com/office/drawing/2016/5/9/chartex" xmlns:cx4="http://schemas.microsoft.com/office/drawing/2016/5/10/chartex" xmlns:cx5="http://schemas.microsoft.com/office/drawing/2016/5/11/chartex" xmlns:cx6="http://schemas.microsoft.com/office/drawing/2016/5/12/chartex" xmlns:cx7="http://schemas.microsoft.com/office/drawing/2016/5/13/chartex" xmlns:cx8="http://schemas.microsoft.com/office/drawing/2016/5/14/chartex" xmlns:mc="http://schemas.openxmlformats.org/markup-compatibility/2006" xmlns:aink="http://schemas.microsoft.com/office/drawing/2016/ink" xmlns:am3d="http://schemas.microsoft.com/office/drawing/2017/model3d" xmlns:o="urn:schemas-microsoft-com:office:office" xmlns:oel="http://schemas.microsoft.com/office/2019/extlst" xmlns:r="http://schemas.openxmlformats.org/officeDocument/2006/relationships" xmlns:m="http://schemas.openxmlformats.org/officeDocument/2006/math" xmlns:v="urn:schemas-microsoft-com:vml" xmlns:wp14="http://schemas.microsoft.com/office/word/2010/wordprocessingDrawing" xmlns:wp="http://schemas.openxmlformats.org/drawingml/2006/wordprocessingDrawing" xmlns:w10="urn:schemas-microsoft-com:office:word" xmlns:w="http://schemas.openxmlformats.org/wordprocessingml/2006/main" xmlns:w14="http://schemas.microsoft.com/office/word/2010/wordml" xmlns:w15="http://schemas.microsoft.com/office/word/2012/wordml" xmlns:w16cex="http://schemas.microsoft.com/office/word/2018/wordml/cex" xmlns:w16cid="http://schemas.microsoft.com/office/word/2016/wordml/cid" xmlns:w16="http://schemas.microsoft.com/office/word/2018/wordml" xmlns:w16sdtdh="http://schemas.microsoft.com/office/word/2020/wordml/sdtdatahash" xmlns:w16se="http://schemas.microsoft.com/office/word/2015/wordml/symex" xmlns:wpg="http://schemas.microsoft.com/office/word/2010/wordprocessingGroup" xmlns:wpi="http://schemas.microsoft.com/office/word/2010/wordprocessingInk" xmlns:wne="http://schemas.microsoft.com/office/word/2006/wordml" xmlns:wps="http://schemas.microsoft.com/office/word/2010/wordprocessingShape" mc:Ignorable="w14 w15 w16se w16cid w16 w16cex w16sdtdh wp14">
+<w:hdr xmlns:wpc="http://schemas.microsoft.com/office/word/2010/wordprocessingCanvas" xmlns:cx="http://schemas.microsoft.com/office/drawing/2014/chartex" xmlns:cx1="http://schemas.microsoft.com/office/drawing/2015/9/8/chartex" xmlns:cx2="http://schemas.microsoft.com/office/drawing/2015/10/21/chartex" xmlns:cx3="http://schemas.microsoft.com/office/drawing/2016/5/9/chartex" xmlns:cx4="http://schemas.microsoft.com/office/drawing/2016/5/10/chartex" xmlns:cx5="http://schemas.microsoft.com/office/drawing/2016/5/11/chartex" xmlns:cx6="http://schemas.microsoft.com/office/drawing/2016/5/12/chartex" xmlns:cx7="http://schemas.microsoft.com/office/drawing/2016/5/13/chartex" xmlns:cx8="http://schemas.microsoft.com/office/drawing/2016/5/14/chartex" xmlns:mc="http://schemas.openxmlformats.org/markup-compatibility/2006" xmlns:aink="http://schemas.microsoft.com/office/drawing/2016/ink" xmlns:am3d="http://schemas.microsoft.com/office/drawing/2017/model3d" xmlns:o="urn:schemas-microsoft-com:office:office" xmlns:oel="http://schemas.microsoft.com/office/2019/extlst" xmlns:r="http://schemas.openxmlformats.org/officeDocument/2006/relationships" xmlns:m="http://schemas.openxmlformats.org/officeDocument/2006/math" xmlns:v="urn:schemas-microsoft-com:vml" xmlns:wp14="http://schemas.microsoft.com/office/word/2010/wordprocessingDrawing" xmlns:wp="http://schemas.openxmlformats.org/drawingml/2006/wordprocessingDrawing" xmlns:w10="urn:schemas-microsoft-com:office:word" xmlns:w="http://schemas.openxmlformats.org/wordprocessingml/2006/main" xmlns:w14="http://schemas.microsoft.com/office/word/2010/wordml" xmlns:w15="http://schemas.microsoft.com/office/word/2012/wordml" xmlns:w16cex="http://schemas.microsoft.com/office/word/2018/wordml/cex" xmlns:w16cid="http://schemas.microsoft.com/office/word/2016/wordml/cid" xmlns:w16="http://schemas.microsoft.com/office/word/2018/wordml" xmlns:w16du="http://schemas.microsoft.com/office/word/2023/wordml/word16du" xmlns:w16sdtdh="http://schemas.microsoft.com/office/word/2020/wordml/sdtdatahash" xmlns:w16sdtfl="http://schemas.microsoft.com/office/word/2024/wordml/sdtformatlock" xmlns:w16se="http://schemas.microsoft.com/office/word/2015/wordml/symex" xmlns:wpg="http://schemas.microsoft.com/office/word/2010/wordprocessingGroup" xmlns:wpi="http://schemas.microsoft.com/office/word/2010/wordprocessingInk" xmlns:wne="http://schemas.microsoft.com/office/word/2006/wordml" xmlns:wps="http://schemas.microsoft.com/office/word/2010/wordprocessingShape" mc:Ignorable="w14 w15 w16se w16cid w16 w16cex w16sdtdh w16sdtfl w16du wp14">
   <w:p>
     <w:pPr>
       <w:pStyle w:val="Header"/>
@@ -1046,7 +1186,7 @@
 </file>
 
 <file path=word/header3.xml><?xml version="1.0" encoding="utf-8"?>
-<w:hdr xmlns:wpc="http://schemas.microsoft.com/office/word/2010/wordprocessingCanvas" xmlns:cx="http://schemas.microsoft.com/office/drawing/2014/chartex" xmlns:cx1="http://schemas.microsoft.com/office/drawing/2015/9/8/chartex" xmlns:cx2="http://schemas.microsoft.com/office/drawing/2015/10/21/chartex" xmlns:cx3="http://schemas.microsoft.com/office/drawing/2016/5/9/chartex" xmlns:cx4="http://schemas.microsoft.com/office/drawing/2016/5/10/chartex" xmlns:cx5="http://schemas.microsoft.com/office/drawing/2016/5/11/chartex" xmlns:cx6="http://schemas.microsoft.com/office/drawing/2016/5/12/chartex" xmlns:cx7="http://schemas.microsoft.com/office/drawing/2016/5/13/chartex" xmlns:cx8="http://schemas.microsoft.com/office/drawing/2016/5/14/chartex" xmlns:mc="http://schemas.openxmlformats.org/markup-compatibility/2006" xmlns:aink="http://schemas.microsoft.com/office/drawing/2016/ink" xmlns:am3d="http://schemas.microsoft.com/office/drawing/2017/model3d" xmlns:o="urn:schemas-microsoft-com:office:office" xmlns:oel="http://schemas.microsoft.com/office/2019/extlst" xmlns:r="http://schemas.openxmlformats.org/officeDocument/2006/relationships" xmlns:m="http://schemas.openxmlformats.org/officeDocument/2006/math" xmlns:v="urn:schemas-microsoft-com:vml" xmlns:wp14="http://schemas.microsoft.com/office/word/2010/wordprocessingDrawing" xmlns:wp="http://schemas.openxmlformats.org/drawingml/2006/wordprocessingDrawing" xmlns:w10="urn:schemas-microsoft-com:office:word" xmlns:w="http://schemas.openxmlformats.org/wordprocessingml/2006/main" xmlns:w14="http://schemas.microsoft.com/office/word/2010/wordml" xmlns:w15="http://schemas.microsoft.com/office/word/2012/wordml" xmlns:w16cex="http://schemas.microsoft.com/office/word/2018/wordml/cex" xmlns:w16cid="http://schemas.microsoft.com/office/word/2016/wordml/cid" xmlns:w16="http://schemas.microsoft.com/office/word/2018/wordml" xmlns:w16sdtdh="http://schemas.microsoft.com/office/word/2020/wordml/sdtdatahash" xmlns:w16se="http://schemas.microsoft.com/office/word/2015/wordml/symex" xmlns:wpg="http://schemas.microsoft.com/office/word/2010/wordprocessingGroup" xmlns:wpi="http://schemas.microsoft.com/office/word/2010/wordprocessingInk" xmlns:wne="http://schemas.microsoft.com/office/word/2006/wordml" xmlns:wps="http://schemas.microsoft.com/office/word/2010/wordprocessingShape" mc:Ignorable="w14 w15 w16se w16cid w16 w16cex w16sdtdh wp14">
+<w:hdr xmlns:wpc="http://schemas.microsoft.com/office/word/2010/wordprocessingCanvas" xmlns:cx="http://schemas.microsoft.com/office/drawing/2014/chartex" xmlns:cx1="http://schemas.microsoft.com/office/drawing/2015/9/8/chartex" xmlns:cx2="http://schemas.microsoft.com/office/drawing/2015/10/21/chartex" xmlns:cx3="http://schemas.microsoft.com/office/drawing/2016/5/9/chartex" xmlns:cx4="http://schemas.microsoft.com/office/drawing/2016/5/10/chartex" xmlns:cx5="http://schemas.microsoft.com/office/drawing/2016/5/11/chartex" xmlns:cx6="http://schemas.microsoft.com/office/drawing/2016/5/12/chartex" xmlns:cx7="http://schemas.microsoft.com/office/drawing/2016/5/13/chartex" xmlns:cx8="http://schemas.microsoft.com/office/drawing/2016/5/14/chartex" xmlns:mc="http://schemas.openxmlformats.org/markup-compatibility/2006" xmlns:aink="http://schemas.microsoft.com/office/drawing/2016/ink" xmlns:am3d="http://schemas.microsoft.com/office/drawing/2017/model3d" xmlns:o="urn:schemas-microsoft-com:office:office" xmlns:oel="http://schemas.microsoft.com/office/2019/extlst" xmlns:r="http://schemas.openxmlformats.org/officeDocument/2006/relationships" xmlns:m="http://schemas.openxmlformats.org/officeDocument/2006/math" xmlns:v="urn:schemas-microsoft-com:vml" xmlns:wp14="http://schemas.microsoft.com/office/word/2010/wordprocessingDrawing" xmlns:wp="http://schemas.openxmlformats.org/drawingml/2006/wordprocessingDrawing" xmlns:w10="urn:schemas-microsoft-com:office:word" xmlns:w="http://schemas.openxmlformats.org/wordprocessingml/2006/main" xmlns:w14="http://schemas.microsoft.com/office/word/2010/wordml" xmlns:w15="http://schemas.microsoft.com/office/word/2012/wordml" xmlns:w16cex="http://schemas.microsoft.com/office/word/2018/wordml/cex" xmlns:w16cid="http://schemas.microsoft.com/office/word/2016/wordml/cid" xmlns:w16="http://schemas.microsoft.com/office/word/2018/wordml" xmlns:w16du="http://schemas.microsoft.com/office/word/2023/wordml/word16du" xmlns:w16sdtdh="http://schemas.microsoft.com/office/word/2020/wordml/sdtdatahash" xmlns:w16sdtfl="http://schemas.microsoft.com/office/word/2024/wordml/sdtformatlock" xmlns:w16se="http://schemas.microsoft.com/office/word/2015/wordml/symex" xmlns:wpg="http://schemas.microsoft.com/office/word/2010/wordprocessingGroup" xmlns:wpi="http://schemas.microsoft.com/office/word/2010/wordprocessingInk" xmlns:wne="http://schemas.microsoft.com/office/word/2006/wordml" xmlns:wps="http://schemas.microsoft.com/office/word/2010/wordprocessingShape" mc:Ignorable="w14 w15 w16se w16cid w16 w16cex w16sdtdh w16sdtfl w16du wp14">
   <w:p>
     <w:pPr>
       <w:pStyle w:val="Header"/>
@@ -1120,7 +1260,7 @@
 </file>
 
 <file path=word/numbering.xml><?xml version="1.0" encoding="utf-8"?>
-<w:numbering xmlns:wpc="http://schemas.microsoft.com/office/word/2010/wordprocessingCanvas" xmlns:cx="http://schemas.microsoft.com/office/drawing/2014/chartex" xmlns:cx1="http://schemas.microsoft.com/office/drawing/2015/9/8/chartex" xmlns:cx2="http://schemas.microsoft.com/office/drawing/2015/10/21/chartex" xmlns:cx3="http://schemas.microsoft.com/office/drawing/2016/5/9/chartex" xmlns:cx4="http://schemas.microsoft.com/office/drawing/2016/5/10/chartex" xmlns:cx5="http://schemas.microsoft.com/office/drawing/2016/5/11/chartex" xmlns:cx6="http://schemas.microsoft.com/office/drawing/2016/5/12/chartex" xmlns:cx7="http://schemas.microsoft.com/office/drawing/2016/5/13/chartex" xmlns:cx8="http://schemas.microsoft.com/office/drawing/2016/5/14/chartex" xmlns:mc="http://schemas.openxmlformats.org/markup-compatibility/2006" xmlns:aink="http://schemas.microsoft.com/office/drawing/2016/ink" xmlns:am3d="http://schemas.microsoft.com/office/drawing/2017/model3d" xmlns:o="urn:schemas-microsoft-com:office:office" xmlns:oel="http://schemas.microsoft.com/office/2019/extlst" xmlns:r="http://schemas.openxmlformats.org/officeDocument/2006/relationships" xmlns:m="http://schemas.openxmlformats.org/officeDocument/2006/math" xmlns:v="urn:schemas-microsoft-com:vml" xmlns:wp14="http://schemas.microsoft.com/office/word/2010/wordprocessingDrawing" xmlns:wp="http://schemas.openxmlformats.org/drawingml/2006/wordprocessingDrawing" xmlns:w10="urn:schemas-microsoft-com:office:word" xmlns:w="http://schemas.openxmlformats.org/wordprocessingml/2006/main" xmlns:w14="http://schemas.microsoft.com/office/word/2010/wordml" xmlns:w15="http://schemas.microsoft.com/office/word/2012/wordml" xmlns:w16cex="http://schemas.microsoft.com/office/word/2018/wordml/cex" xmlns:w16cid="http://schemas.microsoft.com/office/word/2016/wordml/cid" xmlns:w16="http://schemas.microsoft.com/office/word/2018/wordml" xmlns:w16sdtdh="http://schemas.microsoft.com/office/word/2020/wordml/sdtdatahash" xmlns:w16se="http://schemas.microsoft.com/office/word/2015/wordml/symex" xmlns:wpg="http://schemas.microsoft.com/office/word/2010/wordprocessingGroup" xmlns:wpi="http://schemas.microsoft.com/office/word/2010/wordprocessingInk" xmlns:wne="http://schemas.microsoft.com/office/word/2006/wordml" xmlns:wps="http://schemas.microsoft.com/office/word/2010/wordprocessingShape" mc:Ignorable="w14 w15 w16se w16cid w16 w16cex w16sdtdh wp14">
+<w:numbering xmlns:wpc="http://schemas.microsoft.com/office/word/2010/wordprocessingCanvas" xmlns:cx="http://schemas.microsoft.com/office/drawing/2014/chartex" xmlns:cx1="http://schemas.microsoft.com/office/drawing/2015/9/8/chartex" xmlns:cx2="http://schemas.microsoft.com/office/drawing/2015/10/21/chartex" xmlns:cx3="http://schemas.microsoft.com/office/drawing/2016/5/9/chartex" xmlns:cx4="http://schemas.microsoft.com/office/drawing/2016/5/10/chartex" xmlns:cx5="http://schemas.microsoft.com/office/drawing/2016/5/11/chartex" xmlns:cx6="http://schemas.microsoft.com/office/drawing/2016/5/12/chartex" xmlns:cx7="http://schemas.microsoft.com/office/drawing/2016/5/13/chartex" xmlns:cx8="http://schemas.microsoft.com/office/drawing/2016/5/14/chartex" xmlns:mc="http://schemas.openxmlformats.org/markup-compatibility/2006" xmlns:aink="http://schemas.microsoft.com/office/drawing/2016/ink" xmlns:am3d="http://schemas.microsoft.com/office/drawing/2017/model3d" xmlns:o="urn:schemas-microsoft-com:office:office" xmlns:oel="http://schemas.microsoft.com/office/2019/extlst" xmlns:r="http://schemas.openxmlformats.org/officeDocument/2006/relationships" xmlns:m="http://schemas.openxmlformats.org/officeDocument/2006/math" xmlns:v="urn:schemas-microsoft-com:vml" xmlns:wp14="http://schemas.microsoft.com/office/word/2010/wordprocessingDrawing" xmlns:wp="http://schemas.openxmlformats.org/drawingml/2006/wordprocessingDrawing" xmlns:w10="urn:schemas-microsoft-com:office:word" xmlns:w="http://schemas.openxmlformats.org/wordprocessingml/2006/main" xmlns:w14="http://schemas.microsoft.com/office/word/2010/wordml" xmlns:w15="http://schemas.microsoft.com/office/word/2012/wordml" xmlns:w16cex="http://schemas.microsoft.com/office/word/2018/wordml/cex" xmlns:w16cid="http://schemas.microsoft.com/office/word/2016/wordml/cid" xmlns:w16="http://schemas.microsoft.com/office/word/2018/wordml" xmlns:w16du="http://schemas.microsoft.com/office/word/2023/wordml/word16du" xmlns:w16sdtdh="http://schemas.microsoft.com/office/word/2020/wordml/sdtdatahash" xmlns:w16sdtfl="http://schemas.microsoft.com/office/word/2024/wordml/sdtformatlock" xmlns:w16se="http://schemas.microsoft.com/office/word/2015/wordml/symex" xmlns:wpg="http://schemas.microsoft.com/office/word/2010/wordprocessingGroup" xmlns:wpi="http://schemas.microsoft.com/office/word/2010/wordprocessingInk" xmlns:wne="http://schemas.microsoft.com/office/word/2006/wordml" xmlns:wps="http://schemas.microsoft.com/office/word/2010/wordprocessingShape" mc:Ignorable="w14 w15 w16se w16cid w16 w16cex w16sdtdh w16sdtfl w16du wp14">
   <w:abstractNum w:abstractNumId="0" w15:restartNumberingAfterBreak="0">
     <w:nsid w:val="02510D7B"/>
     <w:multiLevelType w:val="hybridMultilevel"/>
@@ -4281,7 +4421,7 @@
 </file>
 
 <file path=word/styles.xml><?xml version="1.0" encoding="utf-8"?>
-<w:styles xmlns:mc="http://schemas.openxmlformats.org/markup-compatibility/2006" xmlns:r="http://schemas.openxmlformats.org/officeDocument/2006/relationships" xmlns:w="http://schemas.openxmlformats.org/wordprocessingml/2006/main" xmlns:w14="http://schemas.microsoft.com/office/word/2010/wordml" xmlns:w15="http://schemas.microsoft.com/office/word/2012/wordml" xmlns:w16cex="http://schemas.microsoft.com/office/word/2018/wordml/cex" xmlns:w16cid="http://schemas.microsoft.com/office/word/2016/wordml/cid" xmlns:w16="http://schemas.microsoft.com/office/word/2018/wordml" xmlns:w16sdtdh="http://schemas.microsoft.com/office/word/2020/wordml/sdtdatahash" xmlns:w16se="http://schemas.microsoft.com/office/word/2015/wordml/symex" mc:Ignorable="w14 w15 w16se w16cid w16 w16cex w16sdtdh">
+<w:styles xmlns:mc="http://schemas.openxmlformats.org/markup-compatibility/2006" xmlns:r="http://schemas.openxmlformats.org/officeDocument/2006/relationships" xmlns:w="http://schemas.openxmlformats.org/wordprocessingml/2006/main" xmlns:w14="http://schemas.microsoft.com/office/word/2010/wordml" xmlns:w15="http://schemas.microsoft.com/office/word/2012/wordml" xmlns:w16cex="http://schemas.microsoft.com/office/word/2018/wordml/cex" xmlns:w16cid="http://schemas.microsoft.com/office/word/2016/wordml/cid" xmlns:w16="http://schemas.microsoft.com/office/word/2018/wordml" xmlns:w16du="http://schemas.microsoft.com/office/word/2023/wordml/word16du" xmlns:w16sdtdh="http://schemas.microsoft.com/office/word/2020/wordml/sdtdatahash" xmlns:w16sdtfl="http://schemas.microsoft.com/office/word/2024/wordml/sdtformatlock" xmlns:w16se="http://schemas.microsoft.com/office/word/2015/wordml/symex" mc:Ignorable="w14 w15 w16se w16cid w16 w16cex w16sdtdh w16sdtfl w16du">
   <w:docDefaults>
     <w:rPrDefault>
       <w:rPr>
@@ -5532,6 +5672,30 @@
       <w:szCs w:val="16"/>
     </w:rPr>
   </w:style>
+  <w:style w:type="character" w:styleId="FollowedHyperlink">
+    <w:name w:val="FollowedHyperlink"/>
+    <w:basedOn w:val="DefaultParagraphFont"/>
+    <w:uiPriority w:val="99"/>
+    <w:semiHidden/>
+    <w:unhideWhenUsed/>
+    <w:rsid w:val="0069287B"/>
+    <w:rPr>
+      <w:color w:val="954F72" w:themeColor="followedHyperlink"/>
+      <w:u w:val="single"/>
+    </w:rPr>
+  </w:style>
+  <w:style w:type="character" w:styleId="UnresolvedMention">
+    <w:name w:val="Unresolved Mention"/>
+    <w:basedOn w:val="DefaultParagraphFont"/>
+    <w:uiPriority w:val="99"/>
+    <w:semiHidden/>
+    <w:unhideWhenUsed/>
+    <w:rsid w:val="0069287B"/>
+    <w:rPr>
+      <w:color w:val="605E5C"/>
+      <w:shd w:val="clear" w:color="auto" w:fill="E1DFDD"/>
+    </w:rPr>
+  </w:style>
 </w:styles>
 </file>
 
@@ -5797,6 +5961,36 @@
 </file>
 
 <file path=customXml/item1.xml><?xml version="1.0" encoding="utf-8"?>
+<?mso-contentType ?>
+<FormTemplates xmlns="http://schemas.microsoft.com/sharepoint/v3/contenttype/forms">
+  <Display>DocumentLibraryForm</Display>
+  <Edit>DocumentLibraryForm</Edit>
+  <New>DocumentLibraryForm</New>
+</FormTemplates>
+</file>
+
+<file path=customXml/item2.xml><?xml version="1.0" encoding="utf-8"?>
+<p:properties xmlns:p="http://schemas.microsoft.com/office/2006/metadata/properties" xmlns:xsi="http://www.w3.org/2001/XMLSchema-instance" xmlns:pc="http://schemas.microsoft.com/office/infopath/2007/PartnerControls">
+  <documentManagement>
+    <IsBuildFile xmlns="B42EA499-AA80-4ED5-9ED5-37A17D3EB549" xsi:nil="true"/>
+    <BookTypeField0 xmlns="B42EA499-AA80-4ED5-9ED5-37A17D3EB549">
+      <Terms xmlns="http://schemas.microsoft.com/office/infopath/2007/PartnerControls">
+        <TermInfo xmlns="http://schemas.microsoft.com/office/infopath/2007/PartnerControls">
+          <TermName xmlns="http://schemas.microsoft.com/office/infopath/2007/PartnerControls">LABS</TermName>
+          <TermId xmlns="http://schemas.microsoft.com/office/infopath/2007/PartnerControls">7be66568-0af1-4eba-a3ac-3014c08f33b3</TermId>
+        </TermInfo>
+      </Terms>
+    </BookTypeField0>
+    <SequenceNumber xmlns="B42EA499-AA80-4ED5-9ED5-37A17D3EB549">1</SequenceNumber>
+  </documentManagement>
+</p:properties>
+</file>
+
+<file path=customXml/item3.xml><?xml version="1.0" encoding="utf-8"?>
+<b:Sources xmlns:b="http://schemas.openxmlformats.org/officeDocument/2006/bibliography" xmlns="http://schemas.openxmlformats.org/officeDocument/2006/bibliography" SelectedStyle="\APASixthEditionOfficeOnline.xsl" StyleName="APA" Version="6"/>
+</file>
+
+<file path=customXml/item4.xml><?xml version="1.0" encoding="utf-8"?>
 <ct:contentTypeSchema xmlns:ct="http://schemas.microsoft.com/office/2006/metadata/contentType" xmlns:ma="http://schemas.microsoft.com/office/2006/metadata/properties/metaAttributes" ct:_="" ma:_="" ma:contentTypeName="Courseware" ma:contentTypeID="0x010100F0967B7CEE8D417F966757887D9466FB005CB7CECC996A5B448C70C3215DE65491" ma:contentTypeVersion="0" ma:contentTypeDescription="Base content type which represents courseware documents" ma:contentTypeScope="" ma:versionID="633ed7bf8a9769dc10b8af609c2e65e8">
   <xsd:schema xmlns:xsd="http://www.w3.org/2001/XMLSchema" xmlns:xs="http://www.w3.org/2001/XMLSchema" xmlns:p="http://schemas.microsoft.com/office/2006/metadata/properties" xmlns:ns2="B42EA499-AA80-4ED5-9ED5-37A17D3EB549" targetNamespace="http://schemas.microsoft.com/office/2006/metadata/properties" ma:root="true" ma:fieldsID="6641bdc0935a9ffdc34b1682c1e0febc" ns2:_="">
     <xsd:import namespace="B42EA499-AA80-4ED5-9ED5-37A17D3EB549"/>
@@ -5936,37 +6130,33 @@
 </ct:contentTypeSchema>
 </file>
 
-<file path=customXml/item2.xml><?xml version="1.0" encoding="utf-8"?>
-<b:Sources xmlns:b="http://schemas.openxmlformats.org/officeDocument/2006/bibliography" xmlns="http://schemas.openxmlformats.org/officeDocument/2006/bibliography" SelectedStyle="\APASixthEditionOfficeOnline.xsl" StyleName="APA" Version="6"/>
+<file path=customXml/itemProps1.xml><?xml version="1.0" encoding="utf-8"?>
+<ds:datastoreItem xmlns:ds="http://schemas.openxmlformats.org/officeDocument/2006/customXml" ds:itemID="{DFBC4FF7-E481-4E84-A126-A855B44779D1}">
+  <ds:schemaRefs>
+    <ds:schemaRef ds:uri="http://schemas.microsoft.com/sharepoint/v3/contenttype/forms"/>
+  </ds:schemaRefs>
+</ds:datastoreItem>
 </file>
 
-<file path=customXml/item3.xml><?xml version="1.0" encoding="utf-8"?>
-<p:properties xmlns:p="http://schemas.microsoft.com/office/2006/metadata/properties" xmlns:xsi="http://www.w3.org/2001/XMLSchema-instance" xmlns:pc="http://schemas.microsoft.com/office/infopath/2007/PartnerControls">
-  <documentManagement>
-    <IsBuildFile xmlns="B42EA499-AA80-4ED5-9ED5-37A17D3EB549" xsi:nil="true"/>
-    <BookTypeField0 xmlns="B42EA499-AA80-4ED5-9ED5-37A17D3EB549">
-      <Terms xmlns="http://schemas.microsoft.com/office/infopath/2007/PartnerControls">
-        <TermInfo xmlns="http://schemas.microsoft.com/office/infopath/2007/PartnerControls">
-          <TermName xmlns="http://schemas.microsoft.com/office/infopath/2007/PartnerControls">LABS</TermName>
-          <TermId xmlns="http://schemas.microsoft.com/office/infopath/2007/PartnerControls">7be66568-0af1-4eba-a3ac-3014c08f33b3</TermId>
-        </TermInfo>
-      </Terms>
-    </BookTypeField0>
-    <SequenceNumber xmlns="B42EA499-AA80-4ED5-9ED5-37A17D3EB549">1</SequenceNumber>
-  </documentManagement>
-</p:properties>
+<file path=customXml/itemProps2.xml><?xml version="1.0" encoding="utf-8"?>
+<ds:datastoreItem xmlns:ds="http://schemas.openxmlformats.org/officeDocument/2006/customXml" ds:itemID="{CC30F272-06F9-4E68-BA55-58FE0421F7FF}">
+  <ds:schemaRefs>
+    <ds:schemaRef ds:uri="http://schemas.microsoft.com/office/2006/metadata/properties"/>
+    <ds:schemaRef ds:uri="http://schemas.microsoft.com/office/infopath/2007/PartnerControls"/>
+    <ds:schemaRef ds:uri="B42EA499-AA80-4ED5-9ED5-37A17D3EB549"/>
+  </ds:schemaRefs>
+</ds:datastoreItem>
 </file>
 
-<file path=customXml/item4.xml><?xml version="1.0" encoding="utf-8"?>
-<?mso-contentType ?>
-<FormTemplates xmlns="http://schemas.microsoft.com/sharepoint/v3/contenttype/forms">
-  <Display>DocumentLibraryForm</Display>
-  <Edit>DocumentLibraryForm</Edit>
-  <New>DocumentLibraryForm</New>
-</FormTemplates>
+<file path=customXml/itemProps3.xml><?xml version="1.0" encoding="utf-8"?>
+<ds:datastoreItem xmlns:ds="http://schemas.openxmlformats.org/officeDocument/2006/customXml" ds:itemID="{38B66090-1015-4F01-BEBB-9A1C00CD2B62}">
+  <ds:schemaRefs>
+    <ds:schemaRef ds:uri="http://schemas.openxmlformats.org/officeDocument/2006/bibliography"/>
+  </ds:schemaRefs>
+</ds:datastoreItem>
 </file>
 
-<file path=customXml/itemProps1.xml><?xml version="1.0" encoding="utf-8"?>
+<file path=customXml/itemProps4.xml><?xml version="1.0" encoding="utf-8"?>
 <ds:datastoreItem xmlns:ds="http://schemas.openxmlformats.org/officeDocument/2006/customXml" ds:itemID="{892F49F5-8A6A-478C-B4B6-8AF1ADE1208E}">
   <ds:schemaRefs>
     <ds:schemaRef ds:uri="http://schemas.microsoft.com/office/2006/metadata/contentType"/>
@@ -5982,30 +6172,4 @@
     <ds:schemaRef ds:uri="http://schemas.microsoft.com/internal/obd"/>
   </ds:schemaRefs>
 </ds:datastoreItem>
-</file>
-
-<file path=customXml/itemProps2.xml><?xml version="1.0" encoding="utf-8"?>
-<ds:datastoreItem xmlns:ds="http://schemas.openxmlformats.org/officeDocument/2006/customXml" ds:itemID="{38B66090-1015-4F01-BEBB-9A1C00CD2B62}">
-  <ds:schemaRefs>
-    <ds:schemaRef ds:uri="http://schemas.openxmlformats.org/officeDocument/2006/bibliography"/>
-  </ds:schemaRefs>
-</ds:datastoreItem>
-</file>
-
-<file path=customXml/itemProps3.xml><?xml version="1.0" encoding="utf-8"?>
-<ds:datastoreItem xmlns:ds="http://schemas.openxmlformats.org/officeDocument/2006/customXml" ds:itemID="{CC30F272-06F9-4E68-BA55-58FE0421F7FF}">
-  <ds:schemaRefs>
-    <ds:schemaRef ds:uri="http://schemas.microsoft.com/office/2006/metadata/properties"/>
-    <ds:schemaRef ds:uri="http://schemas.microsoft.com/office/infopath/2007/PartnerControls"/>
-    <ds:schemaRef ds:uri="B42EA499-AA80-4ED5-9ED5-37A17D3EB549"/>
-  </ds:schemaRefs>
-</ds:datastoreItem>
-</file>
-
-<file path=customXml/itemProps4.xml><?xml version="1.0" encoding="utf-8"?>
-<ds:datastoreItem xmlns:ds="http://schemas.openxmlformats.org/officeDocument/2006/customXml" ds:itemID="{DFBC4FF7-E481-4E84-A126-A855B44779D1}">
-  <ds:schemaRefs>
-    <ds:schemaRef ds:uri="http://schemas.microsoft.com/sharepoint/v3/contenttype/forms"/>
-  </ds:schemaRefs>
-</ds:datastoreItem>
 </file>
</xml_diff>